<commit_message>
publish student projects 2026-07-27 12:21
</commit_message>
<xml_diff>
--- a/Simulator/singapore-epidemic-simulator.docx
+++ b/Simulator/singapore-epidemic-simulator.docx
@@ -1057,9 +1057,9 @@
       <w:pPr>
         <w:pStyle w:val="Heading3"/>
       </w:pPr>
-      <w:bookmarkStart w:id="26" w:name="suggested-goals"/>
-      <w:r>
-        <w:t xml:space="preserve">Suggested Goals</w:t>
+      <w:bookmarkStart w:id="26" w:name="suggested-tech-goals"/>
+      <w:r>
+        <w:t xml:space="preserve">Suggested Tech Goals</w:t>
       </w:r>
       <w:bookmarkEnd w:id="26"/>
     </w:p>
@@ -2301,7 +2301,7 @@
         <w:t xml:space="preserve"> </w:t>
       </w:r>
       <w:r>
-        <w:t xml:space="preserve">— suggested Design/Art picks and TEAM notes for this project; deliverables &amp; quality ladders live in the Design, Art and TEAM pool documents.</w:t>
+        <w:t xml:space="preserve">— suggested Design / UI-UX / Art / TEAM picks for this project; deliverables &amp; quality ladders live in the track pool documents.</w:t>
       </w:r>
     </w:p>
     <w:p>
@@ -2349,7 +2349,7 @@
         <w:pStyle w:val="Compact"/>
       </w:pPr>
       <w:r>
-        <w:t xml:space="preserve">D1 ⭐ Features DD — the outbreak model and its two audiences (operators reading the spread, citizens reading their zone)</w:t>
+        <w:t xml:space="preserve">D1 ⭐ Features Design Document — the outbreak model and its two audiences (operators reading the spread, citizens reading their zone)</w:t>
       </w:r>
     </w:p>
     <w:p>
@@ -2373,18 +2373,6 @@
         <w:pStyle w:val="Compact"/>
       </w:pPr>
       <w:r>
-        <w:t xml:space="preserve">D4 UX Flows &amp; Wireframes — the citizen app screens and the operator screens</w:t>
-      </w:r>
-    </w:p>
-    <w:p>
-      <w:pPr>
-        <w:numPr>
-          <w:ilvl w:val="1"/>
-          <w:numId w:val="1019"/>
-        </w:numPr>
-        <w:pStyle w:val="Compact"/>
-      </w:pPr>
-      <w:r>
         <w:t xml:space="preserve">D7 Parameter Model design — infection, mobility and the 5-day detection-lag parameters</w:t>
       </w:r>
     </w:p>
@@ -2442,18 +2430,6 @@
     <w:p>
       <w:pPr>
         <w:numPr>
-          <w:ilvl w:val="1"/>
-          <w:numId w:val="1020"/>
-        </w:numPr>
-        <w:pStyle w:val="Compact"/>
-      </w:pPr>
-      <w:r>
-        <w:t xml:space="preserve">D10 Mobile UX Adaptation &amp; Ergonomics — the citizen app on the phone</w:t>
-      </w:r>
-    </w:p>
-    <w:p>
-      <w:pPr>
-        <w:numPr>
           <w:ilvl w:val="0"/>
           <w:numId w:val="1018"/>
         </w:numPr>
@@ -2463,7 +2439,13 @@
         <w:rPr>
           <w:b/>
         </w:rPr>
-        <w:t xml:space="preserve">UI/UX M1:</w:t>
+        <w:t xml:space="preserve">UI/UX M1</w:t>
+      </w:r>
+      <w:r>
+        <w:t xml:space="preserve"> </w:t>
+      </w:r>
+      <w:r>
+        <w:t xml:space="preserve">(graded by the UI/UX instructor):</w:t>
       </w:r>
     </w:p>
     <w:p>
@@ -2475,7 +2457,19 @@
         <w:pStyle w:val="Compact"/>
       </w:pPr>
       <w:r>
-        <w:t xml:space="preserve">U1 ⭐ UI Standards &amp; Wireframe Baseline</w:t>
+        <w:t xml:space="preserve">U1 ⭐ UI Standards &amp; Wireframe Baseline — standards for BOTH the ops sim view and the citizen app</w:t>
+      </w:r>
+    </w:p>
+    <w:p>
+      <w:pPr>
+        <w:numPr>
+          <w:ilvl w:val="1"/>
+          <w:numId w:val="1021"/>
+        </w:numPr>
+        <w:pStyle w:val="Compact"/>
+      </w:pPr>
+      <w:r>
+        <w:t xml:space="preserve">U2 UX Flows &amp; Wireframes — the citizen app screens and the operator screens</w:t>
       </w:r>
     </w:p>
     <w:p>
@@ -2502,7 +2496,7 @@
         <w:pStyle w:val="Compact"/>
       </w:pPr>
       <w:r>
-        <w:t xml:space="preserve">U1 ⭐ Functional UI &amp; Usability</w:t>
+        <w:t xml:space="preserve">U1 ⭐ Functional UI &amp; Usability — screens: (ops) scenario select · run view with pause/speed · report; (citizen) zone map · my-zone risk · alerts · lower-risk-zone guidance; both navigable unaided</w:t>
       </w:r>
     </w:p>
     <w:p>
@@ -2514,7 +2508,19 @@
         <w:pStyle w:val="Compact"/>
       </w:pPr>
       <w:r>
-        <w:t xml:space="preserve">U2 ⭐ UX Validation &amp; Final Polished UI — UX validation + final polished UI</w:t>
+        <w:t xml:space="preserve">U2 ⭐ UX Validation &amp; Final Polished UI — validated with real users; polished citizen + ops UI on the mobile target</w:t>
+      </w:r>
+    </w:p>
+    <w:p>
+      <w:pPr>
+        <w:numPr>
+          <w:ilvl w:val="1"/>
+          <w:numId w:val="1022"/>
+        </w:numPr>
+        <w:pStyle w:val="Compact"/>
+      </w:pPr>
+      <w:r>
+        <w:t xml:space="preserve">U5 Mobile UX Adaptation &amp; Ergonomics — the citizen app on the phone (thumb-zone layout, glanceable my-zone status)</w:t>
       </w:r>
     </w:p>
     <w:p>
@@ -2568,18 +2574,6 @@
     <w:p>
       <w:pPr>
         <w:numPr>
-          <w:ilvl w:val="1"/>
-          <w:numId w:val="1023"/>
-        </w:numPr>
-        <w:pStyle w:val="Compact"/>
-      </w:pPr>
-      <w:r>
-        <w:t xml:space="preserve">U1 ⭐ (UI/UX) UI Standards &amp; Wireframe Baseline — standards for BOTH the ops sim view and the citizen app; where Design D4 is picked, the TU1 review assesses those wireframes.</w:t>
-      </w:r>
-    </w:p>
-    <w:p>
-      <w:pPr>
-        <w:numPr>
           <w:ilvl w:val="0"/>
           <w:numId w:val="1018"/>
         </w:numPr>
@@ -2613,7 +2607,7 @@
         <w:pStyle w:val="Compact"/>
       </w:pPr>
       <w:r>
-        <w:t xml:space="preserve">U1 ⭐ (UI/UX) Functional UI &amp; Usability — screens: (ops) scenario select · run view with pause/speed · report; (citizen) zone map · my-zone risk · alerts · lower-risk-zone guidance; both navigable unaided.</w:t>
+        <w:t xml:space="preserve">TP1 ⭐ Final Presentation — 7 min in front of class + instructors: live showcase of the outbreak/scenario editor, prototype demo on the mobile citizen app, team post-mortem (wk14).</w:t>
       </w:r>
     </w:p>
     <w:p>

</xml_diff>